<commit_message>
PDF of classification metrics for in-Github reading
</commit_message>
<xml_diff>
--- a/Python_PD_LGD_EAD_Modeling/1_modified/classification_metrics.docx
+++ b/Python_PD_LGD_EAD_Modeling/1_modified/classification_metrics.docx
@@ -1,17 +1,22 @@
 
 <file path=word/document.xml><?xml version="1.0" encoding="utf-8"?>
-<w:document xmlns:wpc="http://schemas.microsoft.com/office/word/2010/wordprocessingCanvas" xmlns:mo="http://schemas.microsoft.com/office/mac/office/2008/main" xmlns:mc="http://schemas.openxmlformats.org/markup-compatibility/2006" xmlns:mv="urn:schemas-microsoft-com:mac:vml" xmlns:o="urn:schemas-microsoft-com:office:office" xmlns:r="http://schemas.openxmlformats.org/officeDocument/2006/relationships" xmlns:m="http://schemas.openxmlformats.org/officeDocument/2006/math" xmlns:v="urn:schemas-microsoft-com:vml" xmlns:wp14="http://schemas.microsoft.com/office/word/2010/wordprocessingDrawing" xmlns:wp="http://schemas.openxmlformats.org/drawingml/2006/wordprocessingDrawing" xmlns:w10="urn:schemas-microsoft-com:office:word" xmlns:w="http://schemas.openxmlformats.org/wordprocessingml/2006/main" xmlns:w14="http://schemas.microsoft.com/office/word/2010/wordml" xmlns:w15="http://schemas.microsoft.com/office/word/2012/wordml" xmlns:wpg="http://schemas.microsoft.com/office/word/2010/wordprocessingGroup" xmlns:wpi="http://schemas.microsoft.com/office/word/2010/wordprocessingInk" xmlns:wne="http://schemas.microsoft.com/office/word/2006/wordml" xmlns:wps="http://schemas.microsoft.com/office/word/2010/wordprocessingShape" mc:Ignorable="w14 w15 wp14">
+<w:document xmlns:wpc="http://schemas.microsoft.com/office/word/2010/wordprocessingCanvas" xmlns:cx="http://schemas.microsoft.com/office/drawing/2014/chartex" xmlns:mc="http://schemas.openxmlformats.org/markup-compatibility/2006" xmlns:o="urn:schemas-microsoft-com:office:office" xmlns:r="http://schemas.openxmlformats.org/officeDocument/2006/relationships" xmlns:m="http://schemas.openxmlformats.org/officeDocument/2006/math" xmlns:v="urn:schemas-microsoft-com:vml" xmlns:wp14="http://schemas.microsoft.com/office/word/2010/wordprocessingDrawing" xmlns:wp="http://schemas.openxmlformats.org/drawingml/2006/wordprocessingDrawing" xmlns:w10="urn:schemas-microsoft-com:office:word" xmlns:w="http://schemas.openxmlformats.org/wordprocessingml/2006/main" xmlns:w14="http://schemas.microsoft.com/office/word/2010/wordml" xmlns:w15="http://schemas.microsoft.com/office/word/2012/wordml" xmlns:w16se="http://schemas.microsoft.com/office/word/2015/wordml/symex" xmlns:wpg="http://schemas.microsoft.com/office/word/2010/wordprocessingGroup" xmlns:wpi="http://schemas.microsoft.com/office/word/2010/wordprocessingInk" xmlns:wne="http://schemas.microsoft.com/office/word/2006/wordml" xmlns:wps="http://schemas.microsoft.com/office/word/2010/wordprocessingShape" mc:Ignorable="w14 w15 w16se wp14">
   <w:body>
     <w:p>
       <w:pPr>
         <w:pStyle w:val="NoSpacing"/>
-        <w:rPr>
-          <w:rFonts w:ascii="Roboto" w:hAnsi="Roboto"/>
-        </w:rPr>
-      </w:pPr>
-      <w:r>
-        <w:rPr>
-          <w:rFonts w:ascii="Roboto" w:hAnsi="Roboto"/>
+        <w:jc w:val="center"/>
+        <w:rPr>
+          <w:rFonts w:ascii="Roboto Light" w:hAnsi="Roboto Light"/>
+          <w:color w:val="0070C0"/>
+          <w:sz w:val="18"/>
+        </w:rPr>
+      </w:pPr>
+      <w:r>
+        <w:rPr>
+          <w:rFonts w:ascii="Roboto Light" w:hAnsi="Roboto Light"/>
+          <w:color w:val="0070C0"/>
+          <w:sz w:val="28"/>
         </w:rPr>
         <w:t>Explanation of Classification Metrics</w:t>
       </w:r>
@@ -21,6 +26,7 @@
         <w:pStyle w:val="NoSpacing"/>
         <w:rPr>
           <w:rFonts w:ascii="Roboto" w:hAnsi="Roboto"/>
+          <w:sz w:val="16"/>
         </w:rPr>
       </w:pPr>
     </w:p>
@@ -44,11 +50,13 @@
         <w:pStyle w:val="NoSpacing"/>
         <w:rPr>
           <w:rFonts w:ascii="Roboto" w:hAnsi="Roboto"/>
-        </w:rPr>
-      </w:pPr>
-      <w:r>
-        <w:rPr>
-          <w:rFonts w:ascii="Roboto" w:hAnsi="Roboto"/>
+          <w:sz w:val="24"/>
+        </w:rPr>
+      </w:pPr>
+      <w:r>
+        <w:rPr>
+          <w:rFonts w:ascii="Roboto" w:hAnsi="Roboto"/>
+          <w:sz w:val="20"/>
         </w:rPr>
         <w:t>To help evaluate Classification Models. The metrics tell us how well our model is performing.</w:t>
       </w:r>
@@ -58,6 +66,7 @@
         <w:pStyle w:val="NoSpacing"/>
         <w:rPr>
           <w:rFonts w:ascii="Roboto" w:hAnsi="Roboto"/>
+          <w:sz w:val="24"/>
         </w:rPr>
       </w:pPr>
     </w:p>
@@ -114,13 +123,7 @@
         <w:rPr>
           <w:rFonts w:ascii="Roboto" w:hAnsi="Roboto"/>
         </w:rPr>
-        <w:t xml:space="preserve">    - Non-Default = </w:t>
-      </w:r>
-      <w:r>
-        <w:rPr>
-          <w:rFonts w:ascii="Roboto" w:hAnsi="Roboto"/>
-        </w:rPr>
-        <w:t>Negative Class (</w:t>
+        <w:t xml:space="preserve">    - Non-Default = Negative Class (</w:t>
       </w:r>
       <w:r>
         <w:rPr>
@@ -363,13 +366,7 @@
               <w:rPr>
                 <w:rFonts w:ascii="Roboto" w:eastAsia="Calibri" w:hAnsi="Roboto"/>
               </w:rPr>
-              <w:t xml:space="preserve">True </w:t>
-            </w:r>
-            <w:r>
-              <w:rPr>
-                <w:rFonts w:ascii="Roboto" w:eastAsia="Calibri" w:hAnsi="Roboto"/>
-              </w:rPr>
-              <w:t>Negative (TN)</w:t>
+              <w:t>True Negative (TN)</w:t>
             </w:r>
           </w:p>
         </w:tc>
@@ -387,12 +384,12 @@
       <w:pPr>
         <w:pStyle w:val="NoSpacing"/>
         <w:rPr>
-          <w:rFonts w:ascii="Roboto" w:hAnsi="Roboto"/>
-        </w:rPr>
-      </w:pPr>
-      <w:r>
-        <w:rPr>
-          <w:rFonts w:ascii="Roboto" w:hAnsi="Roboto"/>
+          <w:rFonts w:ascii="Roboto Light" w:hAnsi="Roboto Light"/>
+        </w:rPr>
+      </w:pPr>
+      <w:r>
+        <w:rPr>
+          <w:rFonts w:ascii="Roboto Light" w:hAnsi="Roboto Light"/>
         </w:rPr>
         <w:t>Example</w:t>
       </w:r>
@@ -572,14 +569,6 @@
         <w:pStyle w:val="NoSpacing"/>
         <w:rPr>
           <w:rFonts w:ascii="Roboto" w:hAnsi="Roboto"/>
-        </w:rPr>
-      </w:pPr>
-    </w:p>
-    <w:p>
-      <w:pPr>
-        <w:pStyle w:val="NoSpacing"/>
-        <w:rPr>
-          <w:rFonts w:ascii="Roboto" w:hAnsi="Roboto"/>
           <w:color w:val="0070C0"/>
         </w:rPr>
       </w:pPr>
@@ -611,13 +600,7 @@
         <w:rPr>
           <w:rFonts w:ascii="Roboto" w:hAnsi="Roboto"/>
         </w:rPr>
-        <w:t xml:space="preserve"> O</w:t>
-      </w:r>
-      <w:r>
-        <w:rPr>
-          <w:rFonts w:ascii="Roboto" w:hAnsi="Roboto"/>
-        </w:rPr>
-        <w:t>f all Predicted Defaults, how many were Actual Defaults?</w:t>
+        <w:t xml:space="preserve"> Of all Predicted Defaults, how many were Actual Defaults?</w:t>
       </w:r>
     </w:p>
     <w:p>
@@ -681,6 +664,7 @@
         <w:pStyle w:val="NoSpacing"/>
         <w:rPr>
           <w:rFonts w:ascii="Roboto" w:hAnsi="Roboto"/>
+          <w:sz w:val="16"/>
         </w:rPr>
       </w:pPr>
       <w:r>
@@ -696,6 +680,7 @@
         <w:pStyle w:val="NoSpacing"/>
         <w:rPr>
           <w:rFonts w:ascii="Roboto" w:hAnsi="Roboto"/>
+          <w:sz w:val="16"/>
         </w:rPr>
       </w:pPr>
     </w:p>
@@ -712,14 +697,7 @@
           <w:rFonts w:ascii="Roboto" w:hAnsi="Roboto"/>
           <w:color w:val="0070C0"/>
         </w:rPr>
-        <w:t>III. Recall (Sen</w:t>
-      </w:r>
-      <w:r>
-        <w:rPr>
-          <w:rFonts w:ascii="Roboto" w:hAnsi="Roboto"/>
-          <w:color w:val="0070C0"/>
-        </w:rPr>
-        <w:t>sitivity / True Positive Rate)</w:t>
+        <w:t>III. Recall (Sensitivity / True Positive Rate)</w:t>
       </w:r>
     </w:p>
     <w:p>
@@ -805,6 +783,7 @@
         <w:pStyle w:val="NoSpacing"/>
         <w:rPr>
           <w:rFonts w:ascii="Roboto" w:hAnsi="Roboto"/>
+          <w:sz w:val="16"/>
         </w:rPr>
       </w:pPr>
       <w:r>
@@ -812,20 +791,15 @@
           <w:rFonts w:ascii="Roboto" w:hAnsi="Roboto"/>
         </w:rPr>
         <w:tab/>
-        <w:t>High Recall = Few false negatives (Fewer mi</w:t>
-      </w:r>
-      <w:r>
-        <w:rPr>
-          <w:rFonts w:ascii="Roboto" w:hAnsi="Roboto"/>
-        </w:rPr>
-        <w:t>ssed defaulters)</w:t>
-      </w:r>
-    </w:p>
-    <w:p>
-      <w:pPr>
-        <w:pStyle w:val="NoSpacing"/>
-        <w:rPr>
-          <w:rFonts w:ascii="Roboto" w:hAnsi="Roboto"/>
+        <w:t>High Recall = Few false negatives (Fewer missed defaulters)</w:t>
+      </w:r>
+    </w:p>
+    <w:p>
+      <w:pPr>
+        <w:pStyle w:val="NoSpacing"/>
+        <w:rPr>
+          <w:rFonts w:ascii="Roboto" w:hAnsi="Roboto"/>
+          <w:sz w:val="16"/>
         </w:rPr>
       </w:pPr>
     </w:p>
@@ -949,20 +923,34 @@
         <w:pStyle w:val="NoSpacing"/>
         <w:rPr>
           <w:rFonts w:ascii="Roboto" w:hAnsi="Roboto"/>
-        </w:rPr>
-      </w:pPr>
-      <w:r>
-        <w:rPr>
-          <w:rFonts w:ascii="Roboto" w:hAnsi="Roboto"/>
-        </w:rPr>
-        <w:t>→ When FP and FN are both important, the model scores 84%</w:t>
-      </w:r>
-    </w:p>
-    <w:p>
-      <w:pPr>
-        <w:pStyle w:val="NoSpacing"/>
-        <w:rPr>
-          <w:rFonts w:ascii="Roboto" w:hAnsi="Roboto"/>
+          <w:sz w:val="16"/>
+        </w:rPr>
+      </w:pPr>
+      <w:r>
+        <w:rPr>
+          <w:rFonts w:ascii="Roboto" w:hAnsi="Roboto"/>
+        </w:rPr>
+        <w:t xml:space="preserve">→ </w:t>
+      </w:r>
+      <w:r>
+        <w:rPr>
+          <w:rFonts w:ascii="Roboto" w:hAnsi="Roboto"/>
+        </w:rPr>
+        <w:tab/>
+      </w:r>
+      <w:r>
+        <w:rPr>
+          <w:rFonts w:ascii="Roboto" w:hAnsi="Roboto"/>
+        </w:rPr>
+        <w:t>When FP and FN are both important, the model scores 84%</w:t>
+      </w:r>
+    </w:p>
+    <w:p>
+      <w:pPr>
+        <w:pStyle w:val="NoSpacing"/>
+        <w:rPr>
+          <w:rFonts w:ascii="Roboto" w:hAnsi="Roboto"/>
+          <w:sz w:val="16"/>
         </w:rPr>
       </w:pPr>
     </w:p>
@@ -1124,28 +1112,49 @@
         <w:rPr>
           <w:rFonts w:ascii="Roboto" w:hAnsi="Roboto"/>
         </w:rPr>
-        <w:t>→ 85% of the model predictions were correct. This can be misleading for imbalanced datase</w:t>
-      </w:r>
-      <w:r>
-        <w:rPr>
-          <w:rFonts w:ascii="Roboto" w:hAnsi="Roboto"/>
-        </w:rPr>
-        <w:t>ts.</w:t>
-      </w:r>
-    </w:p>
-    <w:p>
-      <w:pPr>
-        <w:pStyle w:val="NoSpacing"/>
-        <w:rPr>
-          <w:rFonts w:ascii="Roboto" w:hAnsi="Roboto"/>
-        </w:rPr>
-      </w:pPr>
-    </w:p>
-    <w:p>
-      <w:pPr>
-        <w:pStyle w:val="NoSpacing"/>
-        <w:rPr>
-          <w:rFonts w:ascii="Roboto" w:hAnsi="Roboto"/>
+        <w:t xml:space="preserve">→ </w:t>
+      </w:r>
+      <w:r>
+        <w:rPr>
+          <w:rFonts w:ascii="Roboto" w:hAnsi="Roboto"/>
+        </w:rPr>
+        <w:tab/>
+      </w:r>
+      <w:r>
+        <w:rPr>
+          <w:rFonts w:ascii="Roboto" w:hAnsi="Roboto"/>
+        </w:rPr>
+        <w:t xml:space="preserve">85% of the </w:t>
+      </w:r>
+      <w:r>
+        <w:rPr>
+          <w:rFonts w:ascii="Roboto" w:hAnsi="Roboto"/>
+        </w:rPr>
+        <w:t>model predictions were correct.</w:t>
+      </w:r>
+    </w:p>
+    <w:p>
+      <w:pPr>
+        <w:pStyle w:val="NoSpacing"/>
+        <w:ind w:firstLine="720"/>
+        <w:rPr>
+          <w:rFonts w:ascii="Roboto" w:hAnsi="Roboto"/>
+          <w:sz w:val="18"/>
+        </w:rPr>
+      </w:pPr>
+      <w:r>
+        <w:rPr>
+          <w:rFonts w:ascii="Roboto" w:hAnsi="Roboto"/>
+        </w:rPr>
+        <w:t>This can be misleading for imbalanced datasets.</w:t>
+      </w:r>
+    </w:p>
+    <w:p>
+      <w:pPr>
+        <w:pStyle w:val="NoSpacing"/>
+        <w:rPr>
+          <w:rFonts w:ascii="Roboto" w:hAnsi="Roboto"/>
+          <w:sz w:val="18"/>
         </w:rPr>
       </w:pPr>
     </w:p>
@@ -1403,13 +1412,7 @@
         <w:rPr>
           <w:rFonts w:ascii="Roboto" w:hAnsi="Roboto"/>
         </w:rPr>
-        <w:t xml:space="preserve">0.5  </w:t>
-      </w:r>
-      <w:r>
-        <w:rPr>
-          <w:rFonts w:ascii="Roboto" w:hAnsi="Roboto"/>
-        </w:rPr>
-        <w:t>»</w:t>
+        <w:t>0.5  »</w:t>
       </w:r>
       <w:proofErr w:type="gramEnd"/>
       <w:r>
@@ -1455,13 +1458,7 @@
         <w:rPr>
           <w:rFonts w:ascii="Roboto" w:hAnsi="Roboto"/>
         </w:rPr>
-        <w:t xml:space="preserve">  </w:t>
-      </w:r>
-      <w:r>
-        <w:rPr>
-          <w:rFonts w:ascii="Roboto" w:hAnsi="Roboto"/>
-        </w:rPr>
-        <w:t>»</w:t>
+        <w:t xml:space="preserve">  »</w:t>
       </w:r>
       <w:proofErr w:type="gramEnd"/>
       <w:r>
@@ -1496,14 +1493,28 @@
         <w:rPr>
           <w:rFonts w:ascii="Roboto" w:hAnsi="Roboto"/>
         </w:rPr>
-        <w:t>→</w:t>
-      </w:r>
-      <w:r>
-        <w:rPr>
-          <w:rFonts w:ascii="Roboto" w:hAnsi="Roboto"/>
-        </w:rPr>
-        <w:t xml:space="preserve"> AUC = 0.92 means a 92% chance of scoring a defaulter higher than a non-defaulter.</w:t>
-      </w:r>
+        <w:t xml:space="preserve">→ </w:t>
+      </w:r>
+      <w:r>
+        <w:rPr>
+          <w:rFonts w:ascii="Roboto" w:hAnsi="Roboto"/>
+        </w:rPr>
+        <w:tab/>
+      </w:r>
+      <w:r>
+        <w:rPr>
+          <w:rFonts w:ascii="Roboto" w:hAnsi="Roboto"/>
+        </w:rPr>
+        <w:t>AUC = 0.92 means a 92% chance of scoring a defaulter higher than a non-defaulter.</w:t>
+      </w:r>
+    </w:p>
+    <w:p>
+      <w:pPr>
+        <w:pStyle w:val="NoSpacing"/>
+        <w:rPr>
+          <w:rFonts w:ascii="Roboto" w:hAnsi="Roboto"/>
+        </w:rPr>
+      </w:pPr>
     </w:p>
     <w:p>
       <w:pPr>
@@ -1536,8 +1547,8 @@
       </w:tblPr>
       <w:tblGrid>
         <w:gridCol w:w="2268"/>
-        <w:gridCol w:w="3544"/>
-        <w:gridCol w:w="3300"/>
+        <w:gridCol w:w="3420"/>
+        <w:gridCol w:w="3424"/>
       </w:tblGrid>
       <w:tr>
         <w:tc>
@@ -1568,7 +1579,7 @@
         </w:tc>
         <w:tc>
           <w:tcPr>
-            <w:tcW w:w="3544" w:type="dxa"/>
+            <w:tcW w:w="3420" w:type="dxa"/>
             <w:tcBorders>
               <w:top w:val="nil"/>
               <w:left w:val="single" w:sz="4" w:space="0" w:color="auto"/>
@@ -1592,7 +1603,7 @@
         </w:tc>
         <w:tc>
           <w:tcPr>
-            <w:tcW w:w="3300" w:type="dxa"/>
+            <w:tcW w:w="3424" w:type="dxa"/>
             <w:tcBorders>
               <w:top w:val="nil"/>
             </w:tcBorders>
@@ -1654,7 +1665,7 @@
         </w:tc>
         <w:tc>
           <w:tcPr>
-            <w:tcW w:w="3544" w:type="dxa"/>
+            <w:tcW w:w="3420" w:type="dxa"/>
           </w:tcPr>
           <w:p>
             <w:pPr>
@@ -1673,7 +1684,7 @@
         </w:tc>
         <w:tc>
           <w:tcPr>
-            <w:tcW w:w="3300" w:type="dxa"/>
+            <w:tcW w:w="3424" w:type="dxa"/>
           </w:tcPr>
           <w:p>
             <w:pPr>
@@ -1725,7 +1736,7 @@
         </w:tc>
         <w:tc>
           <w:tcPr>
-            <w:tcW w:w="3544" w:type="dxa"/>
+            <w:tcW w:w="3420" w:type="dxa"/>
           </w:tcPr>
           <w:p>
             <w:pPr>
@@ -1744,7 +1755,7 @@
         </w:tc>
         <w:tc>
           <w:tcPr>
-            <w:tcW w:w="3300" w:type="dxa"/>
+            <w:tcW w:w="3424" w:type="dxa"/>
           </w:tcPr>
           <w:p>
             <w:pPr>
@@ -1793,7 +1804,7 @@
         </w:tc>
         <w:tc>
           <w:tcPr>
-            <w:tcW w:w="3544" w:type="dxa"/>
+            <w:tcW w:w="3420" w:type="dxa"/>
           </w:tcPr>
           <w:p>
             <w:pPr>
@@ -1812,7 +1823,7 @@
         </w:tc>
         <w:tc>
           <w:tcPr>
-            <w:tcW w:w="3300" w:type="dxa"/>
+            <w:tcW w:w="3424" w:type="dxa"/>
           </w:tcPr>
           <w:p>
             <w:pPr>
@@ -1861,7 +1872,7 @@
         </w:tc>
         <w:tc>
           <w:tcPr>
-            <w:tcW w:w="3544" w:type="dxa"/>
+            <w:tcW w:w="3420" w:type="dxa"/>
           </w:tcPr>
           <w:p>
             <w:pPr>
@@ -1893,7 +1904,7 @@
         </w:tc>
         <w:tc>
           <w:tcPr>
-            <w:tcW w:w="3300" w:type="dxa"/>
+            <w:tcW w:w="3424" w:type="dxa"/>
           </w:tcPr>
           <w:p>
             <w:pPr>
@@ -1942,7 +1953,7 @@
         </w:tc>
         <w:tc>
           <w:tcPr>
-            <w:tcW w:w="3544" w:type="dxa"/>
+            <w:tcW w:w="3420" w:type="dxa"/>
           </w:tcPr>
           <w:p>
             <w:pPr>
@@ -1955,25 +1966,13 @@
               <w:rPr>
                 <w:rFonts w:ascii="Roboto" w:hAnsi="Roboto"/>
               </w:rPr>
-              <w:t xml:space="preserve">(TP+TN) / (TP + FP + TN + </w:t>
-            </w:r>
-            <w:r>
-              <w:rPr>
-                <w:rFonts w:ascii="Roboto" w:hAnsi="Roboto"/>
-              </w:rPr>
-              <w:t>FN</w:t>
-            </w:r>
-            <w:r>
-              <w:rPr>
-                <w:rFonts w:ascii="Roboto" w:hAnsi="Roboto"/>
-              </w:rPr>
-              <w:t>)</w:t>
+              <w:t>(TP+TN) / (TP + FP + TN + FN)</w:t>
             </w:r>
           </w:p>
         </w:tc>
         <w:tc>
           <w:tcPr>
-            <w:tcW w:w="3300" w:type="dxa"/>
+            <w:tcW w:w="3424" w:type="dxa"/>
           </w:tcPr>
           <w:p>
             <w:pPr>
@@ -2022,7 +2021,7 @@
         </w:tc>
         <w:tc>
           <w:tcPr>
-            <w:tcW w:w="3544" w:type="dxa"/>
+            <w:tcW w:w="3420" w:type="dxa"/>
           </w:tcPr>
           <w:p>
             <w:pPr>
@@ -2041,13 +2040,7 @@
               <w:rPr>
                 <w:rFonts w:ascii="Roboto" w:hAnsi="Roboto"/>
               </w:rPr>
-              <w:t>Curve</w:t>
-            </w:r>
-            <w:r>
-              <w:rPr>
-                <w:rFonts w:ascii="Roboto" w:hAnsi="Roboto"/>
-              </w:rPr>
-              <w:t xml:space="preserve"> of the </w:t>
+              <w:t xml:space="preserve">Curve of the </w:t>
             </w:r>
             <w:r>
               <w:rPr>
@@ -2059,7 +2052,7 @@
         </w:tc>
         <w:tc>
           <w:tcPr>
-            <w:tcW w:w="3300" w:type="dxa"/>
+            <w:tcW w:w="3424" w:type="dxa"/>
           </w:tcPr>
           <w:p>
             <w:pPr>
@@ -2093,44 +2086,28 @@
           <w:rFonts w:ascii="Roboto" w:hAnsi="Roboto"/>
         </w:rPr>
       </w:pPr>
-    </w:p>
-    <w:p>
-      <w:pPr>
-        <w:pStyle w:val="NoSpacing"/>
-        <w:rPr>
-          <w:rFonts w:ascii="Roboto" w:hAnsi="Roboto"/>
-        </w:rPr>
-      </w:pPr>
-    </w:p>
-    <w:p>
-      <w:pPr>
-        <w:pStyle w:val="NoSpacing"/>
-        <w:rPr>
-          <w:rFonts w:ascii="Roboto" w:hAnsi="Roboto"/>
-        </w:rPr>
-      </w:pPr>
       <w:r>
         <w:rPr>
           <w:rFonts w:ascii="Roboto" w:hAnsi="Roboto"/>
           <w:color w:val="0070C0"/>
         </w:rPr>
+        <w:t>When to use which Metric</w:t>
+      </w:r>
+    </w:p>
+    <w:p>
+      <w:pPr>
+        <w:pStyle w:val="NoSpacing"/>
+        <w:ind w:firstLine="720"/>
+        <w:rPr>
+          <w:rFonts w:ascii="Roboto" w:hAnsi="Roboto"/>
+        </w:rPr>
+      </w:pPr>
+      <w:r>
+        <w:rPr>
+          <w:rFonts w:ascii="Roboto" w:hAnsi="Roboto"/>
+          <w:b/>
+        </w:rPr>
         <w:lastRenderedPageBreak/>
-        <w:t>When to use which Metric</w:t>
-      </w:r>
-    </w:p>
-    <w:p>
-      <w:pPr>
-        <w:pStyle w:val="NoSpacing"/>
-        <w:ind w:firstLine="720"/>
-        <w:rPr>
-          <w:rFonts w:ascii="Roboto" w:hAnsi="Roboto"/>
-        </w:rPr>
-      </w:pPr>
-      <w:r>
-        <w:rPr>
-          <w:rFonts w:ascii="Roboto" w:hAnsi="Roboto"/>
-          <w:b/>
-        </w:rPr>
         <w:t>Scenario</w:t>
       </w:r>
       <w:r>
@@ -2151,12 +2128,8 @@
         </w:rPr>
         <w:tab/>
       </w:r>
-      <w:r>
-        <w:rPr>
-          <w:rFonts w:ascii="Roboto" w:hAnsi="Roboto"/>
-        </w:rPr>
-        <w:tab/>
-      </w:r>
+      <w:bookmarkStart w:id="0" w:name="_GoBack"/>
+      <w:bookmarkEnd w:id="0"/>
       <w:r>
         <w:rPr>
           <w:rFonts w:ascii="Roboto" w:hAnsi="Roboto"/>
@@ -2299,12 +2272,6 @@
         <w:rPr>
           <w:rFonts w:ascii="Roboto" w:hAnsi="Roboto"/>
         </w:rPr>
-        <w:tab/>
-      </w:r>
-      <w:r>
-        <w:rPr>
-          <w:rFonts w:ascii="Roboto" w:hAnsi="Roboto"/>
-        </w:rPr>
         <w:sym w:font="Wingdings" w:char="F0E0"/>
       </w:r>
       <w:r>
@@ -2322,8 +2289,6 @@
           <w:rFonts w:ascii="Roboto" w:hAnsi="Roboto"/>
         </w:rPr>
       </w:pPr>
-      <w:bookmarkStart w:id="0" w:name="_GoBack"/>
-      <w:bookmarkEnd w:id="0"/>
     </w:p>
     <w:sectPr>
       <w:pgSz w:w="9184" w:h="6463" w:orient="landscape"/>
@@ -2337,8 +2302,8 @@
 </file>
 
 <file path=word/numbering.xml><?xml version="1.0" encoding="utf-8"?>
-<w:numbering xmlns:wpc="http://schemas.microsoft.com/office/word/2010/wordprocessingCanvas" xmlns:mo="http://schemas.microsoft.com/office/mac/office/2008/main" xmlns:mc="http://schemas.openxmlformats.org/markup-compatibility/2006" xmlns:mv="urn:schemas-microsoft-com:mac:vml" xmlns:o="urn:schemas-microsoft-com:office:office" xmlns:r="http://schemas.openxmlformats.org/officeDocument/2006/relationships" xmlns:m="http://schemas.openxmlformats.org/officeDocument/2006/math" xmlns:v="urn:schemas-microsoft-com:vml" xmlns:wp14="http://schemas.microsoft.com/office/word/2010/wordprocessingDrawing" xmlns:wp="http://schemas.openxmlformats.org/drawingml/2006/wordprocessingDrawing" xmlns:w10="urn:schemas-microsoft-com:office:word" xmlns:w="http://schemas.openxmlformats.org/wordprocessingml/2006/main" xmlns:w14="http://schemas.microsoft.com/office/word/2010/wordml" xmlns:w15="http://schemas.microsoft.com/office/word/2012/wordml" xmlns:wpg="http://schemas.microsoft.com/office/word/2010/wordprocessingGroup" xmlns:wpi="http://schemas.microsoft.com/office/word/2010/wordprocessingInk" xmlns:wne="http://schemas.microsoft.com/office/word/2006/wordml" xmlns:wps="http://schemas.microsoft.com/office/word/2010/wordprocessingShape" mc:Ignorable="w14 w15 wp14">
-  <w:abstractNum w:abstractNumId="0">
+<w:numbering xmlns:wpc="http://schemas.microsoft.com/office/word/2010/wordprocessingCanvas" xmlns:cx="http://schemas.microsoft.com/office/drawing/2014/chartex" xmlns:mc="http://schemas.openxmlformats.org/markup-compatibility/2006" xmlns:o="urn:schemas-microsoft-com:office:office" xmlns:r="http://schemas.openxmlformats.org/officeDocument/2006/relationships" xmlns:m="http://schemas.openxmlformats.org/officeDocument/2006/math" xmlns:v="urn:schemas-microsoft-com:vml" xmlns:wp14="http://schemas.microsoft.com/office/word/2010/wordprocessingDrawing" xmlns:wp="http://schemas.openxmlformats.org/drawingml/2006/wordprocessingDrawing" xmlns:w10="urn:schemas-microsoft-com:office:word" xmlns:w="http://schemas.openxmlformats.org/wordprocessingml/2006/main" xmlns:w14="http://schemas.microsoft.com/office/word/2010/wordml" xmlns:w15="http://schemas.microsoft.com/office/word/2012/wordml" xmlns:w16se="http://schemas.microsoft.com/office/word/2015/wordml/symex" xmlns:wpg="http://schemas.microsoft.com/office/word/2010/wordprocessingGroup" xmlns:wpi="http://schemas.microsoft.com/office/word/2010/wordprocessingInk" xmlns:wne="http://schemas.microsoft.com/office/word/2006/wordml" xmlns:wps="http://schemas.microsoft.com/office/word/2010/wordprocessingShape" mc:Ignorable="w14 w15 w16se wp14">
+  <w:abstractNum w:abstractNumId="0" w15:restartNumberingAfterBreak="0">
     <w:nsid w:val="35E250DB"/>
     <w:multiLevelType w:val="multilevel"/>
     <w:tmpl w:val="751E7682"/>
@@ -2478,7 +2443,7 @@
       </w:rPr>
     </w:lvl>
   </w:abstractNum>
-  <w:abstractNum w:abstractNumId="1">
+  <w:abstractNum w:abstractNumId="1" w15:restartNumberingAfterBreak="0">
     <w:nsid w:val="638C35C3"/>
     <w:multiLevelType w:val="multilevel"/>
     <w:tmpl w:val="4FC6F8B0"/>
@@ -2610,7 +2575,7 @@
 </file>
 
 <file path=word/styles.xml><?xml version="1.0" encoding="utf-8"?>
-<w:styles xmlns:mc="http://schemas.openxmlformats.org/markup-compatibility/2006" xmlns:r="http://schemas.openxmlformats.org/officeDocument/2006/relationships" xmlns:w="http://schemas.openxmlformats.org/wordprocessingml/2006/main" xmlns:w14="http://schemas.microsoft.com/office/word/2010/wordml" xmlns:w15="http://schemas.microsoft.com/office/word/2012/wordml" mc:Ignorable="w14 w15">
+<w:styles xmlns:mc="http://schemas.openxmlformats.org/markup-compatibility/2006" xmlns:r="http://schemas.openxmlformats.org/officeDocument/2006/relationships" xmlns:w="http://schemas.openxmlformats.org/wordprocessingml/2006/main" xmlns:w14="http://schemas.microsoft.com/office/word/2010/wordml" xmlns:w15="http://schemas.microsoft.com/office/word/2012/wordml" xmlns:w16se="http://schemas.microsoft.com/office/word/2015/wordml/symex" mc:Ignorable="w14 w15 w16se">
   <w:docDefaults>
     <w:rPrDefault>
       <w:rPr>
@@ -2626,7 +2591,7 @@
       </w:pPr>
     </w:pPrDefault>
   </w:docDefaults>
-  <w:latentStyles w:defLockedState="0" w:defUIPriority="99" w:defSemiHidden="0" w:defUnhideWhenUsed="0" w:defQFormat="0" w:count="380">
+  <w:latentStyles w:defLockedState="0" w:defUIPriority="99" w:defSemiHidden="0" w:defUnhideWhenUsed="0" w:defQFormat="0" w:count="371">
     <w:lsdException w:name="Normal" w:uiPriority="0" w:qFormat="1"/>
     <w:lsdException w:name="heading 1" w:uiPriority="9" w:qFormat="1"/>
     <w:lsdException w:name="heading 2" w:semiHidden="1" w:uiPriority="9" w:unhideWhenUsed="1" w:qFormat="1"/>
@@ -3101,7 +3066,6 @@
     <w:uiPriority w:val="39"/>
     <w:rsid w:val="00F522F5"/>
     <w:tblPr>
-      <w:tblInd w:w="0" w:type="dxa"/>
       <w:tblBorders>
         <w:top w:val="single" w:sz="4" w:space="0" w:color="auto"/>
         <w:left w:val="single" w:sz="4" w:space="0" w:color="auto"/>
@@ -3110,12 +3074,6 @@
         <w:insideH w:val="single" w:sz="4" w:space="0" w:color="auto"/>
         <w:insideV w:val="single" w:sz="4" w:space="0" w:color="auto"/>
       </w:tblBorders>
-      <w:tblCellMar>
-        <w:top w:w="0" w:type="dxa"/>
-        <w:left w:w="108" w:type="dxa"/>
-        <w:bottom w:w="0" w:type="dxa"/>
-        <w:right w:w="108" w:type="dxa"/>
-      </w:tblCellMar>
     </w:tblPr>
   </w:style>
 </w:styles>

</xml_diff>